<commit_message>
FIX: The icons to work with female icons
</commit_message>
<xml_diff>
--- a/frontend/src/assets/finalReportTemplate.docx
+++ b/frontend/src/assets/finalReportTemplate.docx
@@ -69,6 +69,7 @@
     </w:p>
     <w:p>
       <w:pPr>
+        <w:jc w:val="both"/>
         <w:rPr>
           <w:rFonts w:asciiTheme="majorBidi" w:hAnsiTheme="majorBidi" w:cstheme="majorBidi"/>
           <w:b/>
@@ -507,7 +508,51 @@
           <w:szCs w:val="24"/>
           <w:rtl/>
         </w:rPr>
-        <w:t xml:space="preserve">   - ساعات العمل:</w:t>
+        <w:t xml:space="preserve">   - </w:t>
+      </w:r>
+      <w:r>
+        <w:rPr>
+          <w:rFonts w:asciiTheme="majorBidi" w:hAnsiTheme="majorBidi" w:cstheme="majorBidi" w:hint="cs"/>
+          <w:b/>
+          <w:bCs/>
+          <w:sz w:val="24"/>
+          <w:szCs w:val="24"/>
+          <w:rtl/>
+        </w:rPr>
+        <w:t>ال</w:t>
+      </w:r>
+      <w:r>
+        <w:rPr>
+          <w:rFonts w:asciiTheme="majorBidi" w:hAnsiTheme="majorBidi" w:cstheme="majorBidi"/>
+          <w:b/>
+          <w:bCs/>
+          <w:sz w:val="24"/>
+          <w:szCs w:val="24"/>
+          <w:rtl/>
+        </w:rPr>
+        <w:t>ساع</w:t>
+      </w:r>
+      <w:r>
+        <w:rPr>
+          <w:rFonts w:asciiTheme="majorBidi" w:hAnsiTheme="majorBidi" w:cstheme="majorBidi" w:hint="cs"/>
+          <w:b/>
+          <w:bCs/>
+          <w:sz w:val="24"/>
+          <w:szCs w:val="24"/>
+          <w:rtl/>
+        </w:rPr>
+        <w:t>ات التطوعية</w:t>
+      </w:r>
+      <w:r>
+        <w:rPr>
+          <w:rFonts w:asciiTheme="majorBidi" w:hAnsiTheme="majorBidi" w:cstheme="majorBidi"/>
+          <w:b/>
+          <w:bCs/>
+          <w:sz w:val="24"/>
+          <w:szCs w:val="24"/>
+          <w:rtl/>
+        </w:rPr>
+        <w:t>:</w:t>
       </w:r>
       <w:r>
         <w:rPr>
@@ -713,7 +758,6 @@
           <w:rFonts w:asciiTheme="majorBidi" w:hAnsiTheme="majorBidi" w:cstheme="majorBidi"/>
           <w:sz w:val="24"/>
           <w:szCs w:val="24"/>
-          <w:rtl/>
         </w:rPr>
       </w:pPr>
     </w:p>

</xml_diff>